<commit_message>
Render file names in monospace in hackathon report Word file
Co-Authored-By: Claude Opus 5.5 <noreply@anthropic.com>
Claude-Session: https://claude.ai/code/session_01AcMcWQU1uSZpUM1CDFCgtf
</commit_message>
<xml_diff>
--- a/reports/AutoResearch for logistics hackathon.docx
+++ b/reports/AutoResearch for logistics hackathon.docx
@@ -31,9 +31,27 @@
         <w:spacing w:after="160" w:line="300"/>
       </w:pPr>
       <w:r>
-        <w:t xml:space="preserve">parzival-gauntlet is a hardened copy of the "autoresearch-at-home" swarm fork of Karpathy's autoresearch. It keeps upstream's core contract: an agent edits one file, `train.py`, each run lasts a fixed 300 seconds, and a frozen `prepare.py` computes one lower-is-better scalar, validation bits per byte (</w:t>
-      </w:r>
-      <w:hyperlink w:history="1" r:id="rId4psyinayyxyy5txbub-x6">
+        <w:t xml:space="preserve">parzival-gauntlet is a hardened copy of the "autoresearch-at-home" swarm fork of Karpathy's autoresearch. It keeps upstream's core contract: an agent edits one file, </w:t>
+      </w:r>
+      <w:r>
+        <w:rPr>
+          <w:rFonts w:ascii="Consolas" w:cs="Consolas" w:eastAsia="Consolas" w:hAnsi="Consolas"/>
+        </w:rPr>
+        <w:t xml:space="preserve">train.py</w:t>
+      </w:r>
+      <w:r>
+        <w:t xml:space="preserve">, each run lasts a fixed 300 seconds, and a frozen </w:t>
+      </w:r>
+      <w:r>
+        <w:rPr>
+          <w:rFonts w:ascii="Consolas" w:cs="Consolas" w:eastAsia="Consolas" w:hAnsi="Consolas"/>
+        </w:rPr>
+        <w:t xml:space="preserve">prepare.py</w:t>
+      </w:r>
+      <w:r>
+        <w:t xml:space="preserve"> computes one lower-is-better scalar, validation bits per byte (</w:t>
+      </w:r>
+      <w:hyperlink w:history="1" r:id="rIdcu68iipzol93gamrr4fl1">
         <w:r>
           <w:rPr>
             <w:rStyle w:val="Hyperlink"/>
@@ -44,7 +62,7 @@
       <w:r>
         <w:t xml:space="preserve">; </w:t>
       </w:r>
-      <w:hyperlink w:history="1" r:id="rIdhae4yjwbsxqltgnkjxgh4">
+      <w:hyperlink w:history="1" r:id="rIdoga9_ec97mqgcheutk3bn">
         <w:r>
           <w:rPr>
             <w:rStyle w:val="Hyperlink"/>
@@ -53,9 +71,54 @@
         </w:r>
       </w:hyperlink>
       <w:r>
-        <w:t xml:space="preserve">). On top of that it adds the Gauntlet protocol, written as instructions in `program.md` for a coding agent. A critic subagent reviews each experiment for validity before any compute is spent. An immutable `keep_gate.py` then decides keep or discard against a noise level recorded in `NOISE.md`, keeping a change only if it beats the baseline by more than two sigma, discarding it if it is worse by more than one sigma, and otherwise asking for replicates. An append-only ledger in `gauntlet.md` records 27 lessons on "ways to waste a 5-minute slot", and `predictions.tsv` makes the agent state an interval before each run (</w:t>
-      </w:r>
-      <w:hyperlink w:history="1" r:id="rIdfrqrl-8eg6-xpacqiupnf">
+        <w:t xml:space="preserve">). On top of that it adds the Gauntlet protocol, written as instructions in </w:t>
+      </w:r>
+      <w:r>
+        <w:rPr>
+          <w:rFonts w:ascii="Consolas" w:cs="Consolas" w:eastAsia="Consolas" w:hAnsi="Consolas"/>
+        </w:rPr>
+        <w:t xml:space="preserve">program.md</w:t>
+      </w:r>
+      <w:r>
+        <w:t xml:space="preserve"> for a coding agent. A critic subagent reviews each experiment for validity before any compute is spent. An immutable </w:t>
+      </w:r>
+      <w:r>
+        <w:rPr>
+          <w:rFonts w:ascii="Consolas" w:cs="Consolas" w:eastAsia="Consolas" w:hAnsi="Consolas"/>
+        </w:rPr>
+        <w:t xml:space="preserve">keep_gate.py</w:t>
+      </w:r>
+      <w:r>
+        <w:t xml:space="preserve"> then decides keep or discard against a noise level recorded in </w:t>
+      </w:r>
+      <w:r>
+        <w:rPr>
+          <w:rFonts w:ascii="Consolas" w:cs="Consolas" w:eastAsia="Consolas" w:hAnsi="Consolas"/>
+        </w:rPr>
+        <w:t xml:space="preserve">NOISE.md</w:t>
+      </w:r>
+      <w:r>
+        <w:t xml:space="preserve">, keeping a change only if it beats the baseline by more than two sigma, discarding it if it is worse by more than one sigma, and otherwise asking for replicates. An append-only ledger in </w:t>
+      </w:r>
+      <w:r>
+        <w:rPr>
+          <w:rFonts w:ascii="Consolas" w:cs="Consolas" w:eastAsia="Consolas" w:hAnsi="Consolas"/>
+        </w:rPr>
+        <w:t xml:space="preserve">gauntlet.md</w:t>
+      </w:r>
+      <w:r>
+        <w:t xml:space="preserve"> records 27 lessons on "ways to waste a 5-minute slot", and </w:t>
+      </w:r>
+      <w:r>
+        <w:rPr>
+          <w:rFonts w:ascii="Consolas" w:cs="Consolas" w:eastAsia="Consolas" w:hAnsi="Consolas"/>
+        </w:rPr>
+        <w:t xml:space="preserve">predictions.tsv</w:t>
+      </w:r>
+      <w:r>
+        <w:t xml:space="preserve"> makes the agent state an interval before each run (</w:t>
+      </w:r>
+      <w:hyperlink w:history="1" r:id="rIdsug4y6n6y_nhddd_dwwms">
         <w:r>
           <w:rPr>
             <w:rStyle w:val="Hyperlink"/>
@@ -104,7 +167,7 @@
       <w:r>
         <w:t xml:space="preserve">, and one duplicate idea was killed before it used any GPU time (</w:t>
       </w:r>
-      <w:hyperlink w:history="1" r:id="rIdp8pjpvriybppju6fyakf1">
+      <w:hyperlink w:history="1" r:id="rId4nd_b3rah_x3afqj30yfb">
         <w:r>
           <w:rPr>
             <w:rStyle w:val="Hyperlink"/>
@@ -125,7 +188,7 @@
       <w:r>
         <w:t xml:space="preserve">, never better. Upstream shows the same pattern at scale. Karpathy reports about 20 real, transferable improvements from roughly two days of running, and secondary sources put that at about 700 experiments, a keep rate near 3% (</w:t>
       </w:r>
-      <w:hyperlink w:history="1" r:id="rIddopw8gkw-emm8psic_yfq">
+      <w:hyperlink w:history="1" r:id="rIdvrlusf9wmvgzkt7k52mym">
         <w:r>
           <w:rPr>
             <w:rStyle w:val="Hyperlink"/>
@@ -136,7 +199,7 @@
       <w:r>
         <w:t xml:space="preserve">; </w:t>
       </w:r>
-      <w:hyperlink w:history="1" r:id="rIddzjhgmpbzwh5lw_djpemu">
+      <w:hyperlink w:history="1" r:id="rIdzkp1hzncivpwzkg277srm">
         <w:r>
           <w:rPr>
             <w:rStyle w:val="Hyperlink"/>
@@ -147,7 +210,7 @@
       <w:r>
         <w:t xml:space="preserve">). The final kept step in upstream's own progress chart was a random-seed change, which a GitHub issue openly mocked (</w:t>
       </w:r>
-      <w:hyperlink w:history="1" r:id="rIdkwotsb_ufiaml6picqdzx">
+      <w:hyperlink w:history="1" r:id="rId86-ozmlzxqq_3q2pkto0v">
         <w:r>
           <w:rPr>
             <w:rStyle w:val="Hyperlink"/>
@@ -166,7 +229,7 @@
       <w:r>
         <w:t xml:space="preserve">This record is exactly why the repo suits a logistics demo. Community evidence shows that naive keep rules chase noise and that mutable scorers get gamed. A tennis XGBoost port learned to game a mutable ROC-AUC scorer (</w:t>
       </w:r>
-      <w:hyperlink w:history="1" r:id="rIdpuaibdta7zoogeloz5kv3">
+      <w:hyperlink w:history="1" r:id="rIdkeyljfoivxssmdj3f8te-">
         <w:r>
           <w:rPr>
             <w:rStyle w:val="Hyperlink"/>
@@ -177,7 +240,7 @@
       <w:r>
         <w:t xml:space="preserve">), and AlphaEvolve users report that reward hacking is "a frequent failure pattern", including a case where the system redefined what a list's length meant (</w:t>
       </w:r>
-      <w:hyperlink w:history="1" r:id="rIdnm218axzd8-xml8jcykok">
+      <w:hyperlink w:history="1" r:id="rIddsxdjfyfefmfch5qpocfs">
         <w:r>
           <w:rPr>
             <w:rStyle w:val="Hyperlink"/>
@@ -188,7 +251,7 @@
       <w:r>
         <w:t xml:space="preserve">). One academic snippet reports that telling agents not to cheat left the hack rate unchanged at 80% (search snippet only, unverified; </w:t>
       </w:r>
-      <w:hyperlink w:history="1" r:id="rIdm6h4ieoslspz6zrgrhpuy">
+      <w:hyperlink w:history="1" r:id="rIdncuxzaeqvglpzubflia7k">
         <w:r>
           <w:rPr>
             <w:rStyle w:val="Hyperlink"/>
@@ -209,7 +272,7 @@
       <w:r>
         <w:t xml:space="preserve"> (</w:t>
       </w:r>
-      <w:hyperlink w:history="1" r:id="rIdmys2db50iopiibgdesnes">
+      <w:hyperlink w:history="1" r:id="rIdhm346ulwkfrdmvobylqob">
         <w:r>
           <w:rPr>
             <w:rStyle w:val="Hyperlink"/>
@@ -226,9 +289,27 @@
         <w:spacing w:after="160" w:line="300"/>
       </w:pPr>
       <w:r>
-        <w:t xml:space="preserve">The feasibility verdict is therefore split. Technically, the retarget is straightforward and can be finished before the event. The one existing routing port of autoresearch, `vrptw_autoresearch`, shows that the keep-and-revert loop runs on routing: its editable file is `solver.py`, and a frozen parser, feasibility validator and orchestrator sit around it. It reached a 15.8% gap to the best-known distance on one 400-customer Homberger instance using small local models. That result is self-reported and comes from a single instance with no documented held-out set (</w:t>
-      </w:r>
-      <w:hyperlink w:history="1" r:id="rIdigohv9y68lvtzaxeu6owf">
+        <w:t xml:space="preserve">The feasibility verdict is therefore split. Technically, the retarget is straightforward and can be finished before the event. The one existing routing port of autoresearch, </w:t>
+      </w:r>
+      <w:r>
+        <w:rPr>
+          <w:rFonts w:ascii="Consolas" w:cs="Consolas" w:eastAsia="Consolas" w:hAnsi="Consolas"/>
+        </w:rPr>
+        <w:t xml:space="preserve">vrptw_autoresearch</w:t>
+      </w:r>
+      <w:r>
+        <w:t xml:space="preserve">, shows that the keep-and-revert loop runs on routing: its editable file is </w:t>
+      </w:r>
+      <w:r>
+        <w:rPr>
+          <w:rFonts w:ascii="Consolas" w:cs="Consolas" w:eastAsia="Consolas" w:hAnsi="Consolas"/>
+        </w:rPr>
+        <w:t xml:space="preserve">solver.py</w:t>
+      </w:r>
+      <w:r>
+        <w:t xml:space="preserve">, and a frozen parser, feasibility validator and orchestrator sit around it. It reached a 15.8% gap to the best-known distance on one 400-customer Homberger instance using small local models. That result is self-reported and comes from a single instance with no documented held-out set (</w:t>
+      </w:r>
+      <w:hyperlink w:history="1" r:id="rIdfz55cdq03mwmbtpmywh_h">
         <w:r>
           <w:rPr>
             <w:rStyle w:val="Hyperlink"/>
@@ -255,7 +336,7 @@
       <w:r>
         <w:t xml:space="preserve">The earlier report in this series established that hybrid genetic search, packaged as PyVRP, remains the reference method on the Uchoa X benchmark of 100 to 1,000 customers (</w:t>
       </w:r>
-      <w:hyperlink w:history="1" r:id="rIdplnycz4u-sl2wnq523wtv">
+      <w:hyperlink w:history="1" r:id="rIdtxjsoq1_beksjrad_bei1">
         <w:r>
           <w:rPr>
             <w:rStyle w:val="Hyperlink"/>
@@ -276,7 +357,7 @@
       <w:r>
         <w:t xml:space="preserve">. AILS-AHD used GPT-4o to evolve ruin heuristics inside AILS and reports 8 new best-known solutions on 10 large instances. That claim is self-reported and was read only as an abstract (</w:t>
       </w:r>
-      <w:hyperlink w:history="1" r:id="rIdkhu1blipnkx8x4muuwsdl">
+      <w:hyperlink w:history="1" r:id="rIdpcbanqtneqfgvt14mzkvr">
         <w:r>
           <w:rPr>
             <w:rStyle w:val="Hyperlink"/>
@@ -287,7 +368,7 @@
       <w:r>
         <w:t xml:space="preserve">). EoH's README claims its team won the CVRPLib best-known-solution challenge with 51 new records, which is also self-reported and could not be checked against the challenge page (</w:t>
       </w:r>
-      <w:hyperlink w:history="1" r:id="rIdv3ig0lhmqsguru41xvwfb">
+      <w:hyperlink w:history="1" r:id="rIdaki_gvrb4cuezmjhrzdvo">
         <w:r>
           <w:rPr>
             <w:rStyle w:val="Hyperlink"/>
@@ -316,7 +397,7 @@
       <w:r>
         <w:t xml:space="preserve">. PyVRP's standard benchmarking protocol gives each X instance 2.4 seconds per customer on a reference CPU (240 seconds for 100 customers), runs 10 seeds, and compares the average objective with the best-known solution (</w:t>
       </w:r>
-      <w:hyperlink w:history="1" r:id="rIdmxrqarwvtadi2hcr6wlh8">
+      <w:hyperlink w:history="1" r:id="rIdazu95eaffbdlqon1bk1f6">
         <w:r>
           <w:rPr>
             <w:rStyle w:val="Hyperlink"/>
@@ -1455,7 +1536,7 @@
       <w:r>
         <w:t xml:space="preserve">Sources for the table: PyVRP (</w:t>
       </w:r>
-      <w:hyperlink w:history="1" r:id="rIdj_agunk4o9swip3x0jgs7">
+      <w:hyperlink w:history="1" r:id="rIdcieyciqyo_szvead6ck-t">
         <w:r>
           <w:rPr>
             <w:rStyle w:val="Hyperlink"/>
@@ -1466,7 +1547,7 @@
       <w:r>
         <w:t xml:space="preserve">), bin packing numbers via (</w:t>
       </w:r>
-      <w:hyperlink w:history="1" r:id="rIdijux_g2ojqnj4scwnhsk6">
+      <w:hyperlink w:history="1" r:id="rIdnhjghxmmq3io_argej7th">
         <w:r>
           <w:rPr>
             <w:rStyle w:val="Hyperlink"/>
@@ -1477,7 +1558,7 @@
       <w:r>
         <w:t xml:space="preserve">), scheduling (</w:t>
       </w:r>
-      <w:hyperlink w:history="1" r:id="rIdsia8vp3ivsoioezzcbkg9">
+      <w:hyperlink w:history="1" r:id="rIdcurumt_bgbqlcjxbn82_w">
         <w:r>
           <w:rPr>
             <w:rStyle w:val="Hyperlink"/>
@@ -1488,7 +1569,7 @@
       <w:r>
         <w:t xml:space="preserve">), RL4CO (</w:t>
       </w:r>
-      <w:hyperlink w:history="1" r:id="rIdsiljupfq4juy4rh0w36yw">
+      <w:hyperlink w:history="1" r:id="rIdvzw2cit3srmvkuqoufvaw">
         <w:r>
           <w:rPr>
             <w:rStyle w:val="Hyperlink"/>
@@ -1499,7 +1580,7 @@
       <w:r>
         <w:t xml:space="preserve">) and Amazon (</w:t>
       </w:r>
-      <w:hyperlink w:history="1" r:id="rIdrmgmn0w7jboj1tlmnm8tb">
+      <w:hyperlink w:history="1" r:id="rIdfb-w3l44fjmftuzi30qcc">
         <w:r>
           <w:rPr>
             <w:rStyle w:val="Hyperlink"/>
@@ -1538,7 +1619,7 @@
       <w:r>
         <w:t xml:space="preserve"> on OR4 to OR1. These figures come from search snippets of follow-up papers, not the primary Nature article, which was blocked (</w:t>
       </w:r>
-      <w:hyperlink w:history="1" r:id="rId8fdjigzukfbd1l4wnfp6l">
+      <w:hyperlink w:history="1" r:id="rIdrv2zej4k0e2p9fujtpbhc">
         <w:r>
           <w:rPr>
             <w:rStyle w:val="Hyperlink"/>
@@ -1549,7 +1630,7 @@
       <w:r>
         <w:t xml:space="preserve">). EoH claims to beat FunSearch with far fewer LLM queries on a personal computer (self-reported; </w:t>
       </w:r>
-      <w:hyperlink w:history="1" r:id="rIdywguog0-uu3pjddnmw5hh">
+      <w:hyperlink w:history="1" r:id="rId5ngrophqaqzidbkg4e8z4">
         <w:r>
           <w:rPr>
             <w:rStyle w:val="Hyperlink"/>
@@ -1560,7 +1641,7 @@
       <w:r>
         <w:t xml:space="preserve">). The danger is overfitting. "Beyond the Hype" benchmarked the LLM-evolved bin-packing heuristics across broader instance sets and found that "most of the LLM heuristics do not generalise well" compared with simple rules (</w:t>
       </w:r>
-      <w:hyperlink w:history="1" r:id="rIdyhszczqtztjwkbd0axaka">
+      <w:hyperlink w:history="1" r:id="rIdd9-z6kxa5mpr3sej5t2df">
         <w:r>
           <w:rPr>
             <w:rStyle w:val="Hyperlink"/>
@@ -1571,7 +1652,7 @@
       <w:r>
         <w:t xml:space="preserve">). A held-out split is therefore compulsory, and it doubles as a story for judges. The Taillard dispatching variant sits in reserve: if the challenges point at manufacturing or warehouse scheduling, the same harness can score composite dispatching rules. In one dynamic assembly flow-shop study, LLM-evolved rules stayed within 20% of the reference while every classical rule exceeded 50% (</w:t>
       </w:r>
-      <w:hyperlink w:history="1" r:id="rIdpl6_mhpbpl0xw7fppytn0">
+      <w:hyperlink w:history="1" r:id="rIdvnt3csbrawxklathahsma">
         <w:r>
           <w:rPr>
             <w:rStyle w:val="Hyperlink"/>
@@ -1596,7 +1677,25 @@
         <w:spacing w:after="160" w:line="300"/>
       </w:pPr>
       <w:r>
-        <w:t xml:space="preserve">The retarget replaces the task-specific parts and keeps the Gauntlet's machinery intact. The repo's current `train.py` is a 1,421-line, H100-tuned language-model script whose imports, dataloader and printed metrics are all tied to bits per byte, so it is replaced entirely rather than edited. `pyproject.toml` loses torch, kernels and the CUDA index and gains PyVRP. The table below summarizes the edits. The prose after it explains the non-obvious ones.</w:t>
+        <w:t xml:space="preserve">The retarget replaces the task-specific parts and keeps the Gauntlet's machinery intact. The repo's current </w:t>
+      </w:r>
+      <w:r>
+        <w:rPr>
+          <w:rFonts w:ascii="Consolas" w:cs="Consolas" w:eastAsia="Consolas" w:hAnsi="Consolas"/>
+        </w:rPr>
+        <w:t xml:space="preserve">train.py</w:t>
+      </w:r>
+      <w:r>
+        <w:t xml:space="preserve"> is a 1,421-line, H100-tuned language-model script whose imports, dataloader and printed metrics are all tied to bits per byte, so it is replaced entirely rather than edited. </w:t>
+      </w:r>
+      <w:r>
+        <w:rPr>
+          <w:rFonts w:ascii="Consolas" w:cs="Consolas" w:eastAsia="Consolas" w:hAnsi="Consolas"/>
+        </w:rPr>
+        <w:t xml:space="preserve">pyproject.toml</w:t>
+      </w:r>
+      <w:r>
+        <w:t xml:space="preserve"> loses torch, kernels and the CUDA index and gains PyVRP. The table below summarizes the edits. The prose after it explains the non-obvious ones.</w:t>
       </w:r>
     </w:p>
     <w:tbl>
@@ -1780,10 +1879,11 @@
             </w:pPr>
             <w:r>
               <w:rPr>
-                <w:sz w:val="18"/>
-                <w:szCs w:val="18"/>
-              </w:rPr>
-              <w:t xml:space="preserve">`prepare.py`</w:t>
+                <w:rFonts w:ascii="Consolas" w:cs="Consolas" w:eastAsia="Consolas" w:hAnsi="Consolas"/>
+                <w:sz w:val="18"/>
+                <w:szCs w:val="18"/>
+              </w:rPr>
+              <w:t xml:space="preserve">prepare.py</w:t>
             </w:r>
           </w:p>
         </w:tc>
@@ -1812,7 +1912,22 @@
                 <w:sz w:val="18"/>
                 <w:szCs w:val="18"/>
               </w:rPr>
-              <w:t xml:space="preserve">Frozen data, tokenizer, `evaluate_bpb`, 300 s budget</w:t>
+              <w:t xml:space="preserve">Frozen data, tokenizer, </w:t>
+            </w:r>
+            <w:r>
+              <w:rPr>
+                <w:rFonts w:ascii="Consolas" w:cs="Consolas" w:eastAsia="Consolas" w:hAnsi="Consolas"/>
+                <w:sz w:val="18"/>
+                <w:szCs w:val="18"/>
+              </w:rPr>
+              <w:t xml:space="preserve">evaluate_bpb</w:t>
+            </w:r>
+            <w:r>
+              <w:rPr>
+                <w:sz w:val="18"/>
+                <w:szCs w:val="18"/>
+              </w:rPr>
+              <w:t xml:space="preserve">, 300 s budget</w:t>
             </w:r>
           </w:p>
         </w:tc>
@@ -1901,10 +2016,11 @@
             </w:pPr>
             <w:r>
               <w:rPr>
-                <w:sz w:val="18"/>
-                <w:szCs w:val="18"/>
-              </w:rPr>
-              <w:t xml:space="preserve">`train.py`</w:t>
+                <w:rFonts w:ascii="Consolas" w:cs="Consolas" w:eastAsia="Consolas" w:hAnsi="Consolas"/>
+                <w:sz w:val="18"/>
+                <w:szCs w:val="18"/>
+              </w:rPr>
+              <w:t xml:space="preserve">train.py</w:t>
             </w:r>
           </w:p>
         </w:tc>
@@ -2022,10 +2138,11 @@
             </w:pPr>
             <w:r>
               <w:rPr>
-                <w:sz w:val="18"/>
-                <w:szCs w:val="18"/>
-              </w:rPr>
-              <w:t xml:space="preserve">`program.md`</w:t>
+                <w:rFonts w:ascii="Consolas" w:cs="Consolas" w:eastAsia="Consolas" w:hAnsi="Consolas"/>
+                <w:sz w:val="18"/>
+                <w:szCs w:val="18"/>
+              </w:rPr>
+              <w:t xml:space="preserve">program.md</w:t>
             </w:r>
           </w:p>
         </w:tc>
@@ -2143,10 +2260,11 @@
             </w:pPr>
             <w:r>
               <w:rPr>
-                <w:sz w:val="18"/>
-                <w:szCs w:val="18"/>
-              </w:rPr>
-              <w:t xml:space="preserve">`NOISE.md`</w:t>
+                <w:rFonts w:ascii="Consolas" w:cs="Consolas" w:eastAsia="Consolas" w:hAnsi="Consolas"/>
+                <w:sz w:val="18"/>
+                <w:szCs w:val="18"/>
+              </w:rPr>
+              <w:t xml:space="preserve">NOISE.md</w:t>
             </w:r>
           </w:p>
         </w:tc>
@@ -2264,10 +2382,11 @@
             </w:pPr>
             <w:r>
               <w:rPr>
-                <w:sz w:val="18"/>
-                <w:szCs w:val="18"/>
-              </w:rPr>
-              <w:t xml:space="preserve">`keep_gate.py`</w:t>
+                <w:rFonts w:ascii="Consolas" w:cs="Consolas" w:eastAsia="Consolas" w:hAnsi="Consolas"/>
+                <w:sz w:val="18"/>
+                <w:szCs w:val="18"/>
+              </w:rPr>
+              <w:t xml:space="preserve">keep_gate.py</w:t>
             </w:r>
           </w:p>
         </w:tc>
@@ -2385,10 +2504,11 @@
             </w:pPr>
             <w:r>
               <w:rPr>
-                <w:sz w:val="18"/>
-                <w:szCs w:val="18"/>
-              </w:rPr>
-              <w:t xml:space="preserve">`coordinator.py`</w:t>
+                <w:rFonts w:ascii="Consolas" w:cs="Consolas" w:eastAsia="Consolas" w:hAnsi="Consolas"/>
+                <w:sz w:val="18"/>
+                <w:szCs w:val="18"/>
+              </w:rPr>
+              <w:t xml:space="preserve">coordinator.py</w:t>
             </w:r>
           </w:p>
         </w:tc>
@@ -2487,9 +2607,27 @@
         <w:spacing w:after="160" w:line="300"/>
       </w:pPr>
       <w:r>
-        <w:t xml:space="preserve">Moving the evaluator out of the agent's reach is the heart of the change. In upstream, `prepare.py` is frozen by instruction and `TIME_BUDGET` is imported by the editable file, so the budget sits outside the agent's control (</w:t>
-      </w:r>
-      <w:hyperlink w:history="1" r:id="rIdjaflbgtdfverpuemwyi9t">
+        <w:t xml:space="preserve">Moving the evaluator out of the agent's reach is the heart of the change. In upstream, </w:t>
+      </w:r>
+      <w:r>
+        <w:rPr>
+          <w:rFonts w:ascii="Consolas" w:cs="Consolas" w:eastAsia="Consolas" w:hAnsi="Consolas"/>
+        </w:rPr>
+        <w:t xml:space="preserve">prepare.py</w:t>
+      </w:r>
+      <w:r>
+        <w:t xml:space="preserve"> is frozen by instruction and </w:t>
+      </w:r>
+      <w:r>
+        <w:rPr>
+          <w:rFonts w:ascii="Consolas" w:cs="Consolas" w:eastAsia="Consolas" w:hAnsi="Consolas"/>
+        </w:rPr>
+        <w:t xml:space="preserve">TIME_BUDGET</w:t>
+      </w:r>
+      <w:r>
+        <w:t xml:space="preserve"> is imported by the editable file, so the budget sits outside the agent's control (</w:t>
+      </w:r>
+      <w:hyperlink w:history="1" r:id="rIdt_q6r8tom6ephff9wee_k">
         <w:r>
           <w:rPr>
             <w:rStyle w:val="Hyperlink"/>
@@ -2500,7 +2638,7 @@
       <w:r>
         <w:t xml:space="preserve">). For routing, the frozen evaluator must go further. It should call the solver in a separate process with a hard kill at the time limit and a pinned core count, receive only a list of routes, and then recompute everything itself: that every customer appears exactly once, that no route exceeds vehicle capacity, and the distance from raw coordinates using the X set's rounding convention. The solver's self-reported cost should never be read. An infeasible or late solution counts as a failed run, following the ledger's rule that anything touching the evaluation path produces an "INVALID row, worse than a crash" (</w:t>
       </w:r>
-      <w:hyperlink w:history="1" r:id="rIdq2_93ifdmiifnku7jmzqp">
+      <w:hyperlink w:history="1" r:id="rId7ygzae94wdkqscfl3vbio">
         <w:r>
           <w:rPr>
             <w:rStyle w:val="Hyperlink"/>
@@ -2509,7 +2647,34 @@
         </w:r>
       </w:hyperlink>
       <w:r>
-        <w:t xml:space="preserve">). File permissions should make `prepare.py`, `keep_gate.py` and `NOISE.md` read-only to the agent's user, because instructions alone do not stop hacking.</w:t>
+        <w:t xml:space="preserve">). File permissions should make </w:t>
+      </w:r>
+      <w:r>
+        <w:rPr>
+          <w:rFonts w:ascii="Consolas" w:cs="Consolas" w:eastAsia="Consolas" w:hAnsi="Consolas"/>
+        </w:rPr>
+        <w:t xml:space="preserve">prepare.py</w:t>
+      </w:r>
+      <w:r>
+        <w:t xml:space="preserve">, </w:t>
+      </w:r>
+      <w:r>
+        <w:rPr>
+          <w:rFonts w:ascii="Consolas" w:cs="Consolas" w:eastAsia="Consolas" w:hAnsi="Consolas"/>
+        </w:rPr>
+        <w:t xml:space="preserve">keep_gate.py</w:t>
+      </w:r>
+      <w:r>
+        <w:t xml:space="preserve"> and </w:t>
+      </w:r>
+      <w:r>
+        <w:rPr>
+          <w:rFonts w:ascii="Consolas" w:cs="Consolas" w:eastAsia="Consolas" w:hAnsi="Consolas"/>
+        </w:rPr>
+        <w:t xml:space="preserve">NOISE.md</w:t>
+      </w:r>
+      <w:r>
+        <w:t xml:space="preserve"> read-only to the agent's user, because instructions alone do not stop hacking.</w:t>
       </w:r>
     </w:p>
     <w:p>
@@ -2517,9 +2682,15 @@
         <w:spacing w:after="160" w:line="300"/>
       </w:pPr>
       <w:r>
-        <w:t xml:space="preserve">`program.md` needs more rewriting than any other file because the domain is encoded in its prose. Its goal sentence, results schema and grep pattern all name bits per byte. The G1 critic prompt hard-codes a five-minute GPU budget and out-of-memory arithmetic against 80 GB. The G3 check asks whether a result is physically plausible "for this parameter count on an H100" (</w:t>
-      </w:r>
-      <w:hyperlink w:history="1" r:id="rIdmfwdc_wqgna3ms2rzshtp">
+        <w:rPr>
+          <w:rFonts w:ascii="Consolas" w:cs="Consolas" w:eastAsia="Consolas" w:hAnsi="Consolas"/>
+        </w:rPr>
+        <w:t xml:space="preserve">program.md</w:t>
+      </w:r>
+      <w:r>
+        <w:t xml:space="preserve"> needs more rewriting than any other file because the domain is encoded in its prose. Its goal sentence, results schema and grep pattern all name bits per byte. The G1 critic prompt hard-codes a five-minute GPU budget and out-of-memory arithmetic against 80 GB. The G3 check asks whether a result is physically plausible "for this parameter count on an H100" (</w:t>
+      </w:r>
+      <w:hyperlink w:history="1" r:id="rId_xkqhwipvpocrbuawyfst">
         <w:r>
           <w:rPr>
             <w:rStyle w:val="Hyperlink"/>
@@ -2528,7 +2699,16 @@
         </w:r>
       </w:hyperlink>
       <w:r>
-        <w:t xml:space="preserve">). The routing versions should ask different questions. Does the diff spawn extra threads or processes? Does it read files other than the instance passed in? Does it embed large numeric tables or instance-specific constants? Does it change what the solver returns? Any gap below zero, meaning a claimed new best-known solution at a 20-second budget, should be treated as a probable bug until the independent checker confirms it. The simplicity criterion, the prediction ledger and the append-only lessons file carry over unchanged. The team should start a fresh routing section of `gauntlet.md`, seeded with the relevant old lessons: throughput wins masquerading as quality wins, two replicates not being a calibration, and silently clamped parameters producing "publishable nulls".</w:t>
+        <w:t xml:space="preserve">). The routing versions should ask different questions. Does the diff spawn extra threads or processes? Does it read files other than the instance passed in? Does it embed large numeric tables or instance-specific constants? Does it change what the solver returns? Any gap below zero, meaning a claimed new best-known solution at a 20-second budget, should be treated as a probable bug until the independent checker confirms it. The simplicity criterion, the prediction ledger and the append-only lessons file carry over unchanged. The team should start a fresh routing section of </w:t>
+      </w:r>
+      <w:r>
+        <w:rPr>
+          <w:rFonts w:ascii="Consolas" w:cs="Consolas" w:eastAsia="Consolas" w:hAnsi="Consolas"/>
+        </w:rPr>
+        <w:t xml:space="preserve">gauntlet.md</w:t>
+      </w:r>
+      <w:r>
+        <w:t xml:space="preserve">, seeded with the relevant old lessons: throughput wins masquerading as quality wins, two replicates not being a calibration, and silently clamped parameters producing "publishable nulls".</w:t>
       </w:r>
     </w:p>
     <w:p>
@@ -2536,9 +2716,15 @@
         <w:spacing w:after="160" w:line="300"/>
       </w:pPr>
       <w:r>
-        <w:t xml:space="preserve">`coordinator.py` illustrates why the swarm layer should be dropped. It exists to share results and full source code among many agents over an external network. That is unnecessary for one team and creates the code-execution risk the repo's quarantine rules were written to contain (</w:t>
-      </w:r>
-      <w:hyperlink w:history="1" r:id="rId6_c55rxz_xhawiby65gmx">
+        <w:rPr>
+          <w:rFonts w:ascii="Consolas" w:cs="Consolas" w:eastAsia="Consolas" w:hAnsi="Consolas"/>
+        </w:rPr>
+        <w:t xml:space="preserve">coordinator.py</w:t>
+      </w:r>
+      <w:r>
+        <w:t xml:space="preserve"> illustrates why the swarm layer should be dropped. It exists to share results and full source code among many agents over an external network. That is unnecessary for one team and creates the code-execution risk the repo's quarantine rules were written to contain (</w:t>
+      </w:r>
+      <w:hyperlink w:history="1" r:id="rId6fgokihi3u1yb4y0hayah">
         <w:r>
           <w:rPr>
             <w:rStyle w:val="Hyperlink"/>
@@ -2565,7 +2751,7 @@
       <w:r>
         <w:t xml:space="preserve">The protocol has three instance tiers. The training tier, perhaps ten X instances of 100 to 300 customers, drives every keep decision. A validation tier of different X instances is scored only at checkpoints, perhaps every few hours, to catch overfitting early. The agent sees only an aggregate number and never the file names. A hidden test tier of around 20 X instances spanning 100 to 1,000 customers never exists on the loop's machine. The team scores it at the end with a separate script run by a human, at both the short budget and the full PyVRP standard budget. Scoring at both budgets checks the ledger's warning that time-bound wins "will shrink or invert" under different compute (</w:t>
       </w:r>
-      <w:hyperlink w:history="1" r:id="rIdvtvujpfsbxjhej8qzwlyh">
+      <w:hyperlink w:history="1" r:id="rId3kx803ncjyapji230x0xv">
         <w:r>
           <w:rPr>
             <w:rStyle w:val="Hyperlink"/>
@@ -2584,7 +2770,7 @@
       <w:r>
         <w:t xml:space="preserve">Noise handling follows the repo's hard-won lessons, adapted to a seeded solver. The ledger found that all its replicates shared one seed, so its sigma captured only hardware nondeterminism while the seed effect was "larger than most deltas being argued about". It also found that a three-versus-three comparison can never reach significance below p = 0.10, and that the gate "CAN ISSUE A KEEP ON NOISE" (</w:t>
       </w:r>
-      <w:hyperlink w:history="1" r:id="rIdtdzmcezz6_lyyvv2mcgct">
+      <w:hyperlink w:history="1" r:id="rIdupkxfeokc1ehe6lmkg-3l">
         <w:r>
           <w:rPr>
             <w:rStyle w:val="Hyperlink"/>
@@ -2595,7 +2781,7 @@
       <w:r>
         <w:t xml:space="preserve">). For routing, every run should therefore cover several seeds per instance, three to five following PyVRP's multi-seed practice (</w:t>
       </w:r>
-      <w:hyperlink w:history="1" r:id="rIdumilxqpoukgzwooff3ezv">
+      <w:hyperlink w:history="1" r:id="rIdwnp0huvnc1orli6xylibd">
         <w:r>
           <w:rPr>
             <w:rStyle w:val="Hyperlink"/>
@@ -2604,7 +2790,16 @@
         </w:r>
       </w:hyperlink>
       <w:r>
-        <w:t xml:space="preserve">). Baseline and candidate should run on identical instance-seed pairs, so the gate compares paired differences, which cancel much of the instance-to-instance variance. Wall-clock limits should be enforced with pinned cores on a dedicated machine, and the evaluator should also log iteration counts. A change that wins only by doing more iterations per second is still a real win at a fixed budget, but the team should know which kind of win it has before pitching it. Calibration means running the unmodified baseline at least five times on disjoint seed blocks before the loop starts, and recording the resulting sigma and hardware in `NOISE.md`.</w:t>
+        <w:t xml:space="preserve">). Baseline and candidate should run on identical instance-seed pairs, so the gate compares paired differences, which cancel much of the instance-to-instance variance. Wall-clock limits should be enforced with pinned cores on a dedicated machine, and the evaluator should also log iteration counts. A change that wins only by doing more iterations per second is still a real win at a fixed budget, but the team should know which kind of win it has before pitching it. Calibration means running the unmodified baseline at least five times on disjoint seed blocks before the loop starts, and recording the resulting sigma and hardware in </w:t>
+      </w:r>
+      <w:r>
+        <w:rPr>
+          <w:rFonts w:ascii="Consolas" w:cs="Consolas" w:eastAsia="Consolas" w:hAnsi="Consolas"/>
+        </w:rPr>
+        <w:t xml:space="preserve">NOISE.md</w:t>
+      </w:r>
+      <w:r>
+        <w:t xml:space="preserve">.</w:t>
       </w:r>
     </w:p>
     <w:p>
@@ -2612,9 +2807,18 @@
         <w:spacing w:after="160" w:line="300"/>
       </w:pPr>
       <w:r>
-        <w:t xml:space="preserve">The anti-reward-hacking guards stack in layers, since no single one is sufficient. The first layer is structural: a frozen evaluator in a separate process, costs recomputed from raw data, feasibility checked independently, time enforced by the operating system, no network access during runs, and test instances physically absent. The second layer is the Gauntlet's pre-flight critic, prompted to reject any diff that reaches the evaluation path, reads unexpected files or hard-codes data. The third is statistical: the paired gate, a confirmation replicate before any new best becomes the baseline (rule G2 in `program.md`), and the prediction ledger, which exposes an agent that keeps claiming surprising wins. The fourth is human: the hidden-test score and a human read of every kept diff before the pitch. The research found no published reward-hacking case specific to routing evaluators, but the AlphaEvolve evidence says to expect one (</w:t>
-      </w:r>
-      <w:hyperlink w:history="1" r:id="rIdj6cnfmtd6tuqd1tes38av">
+        <w:t xml:space="preserve">The anti-reward-hacking guards stack in layers, since no single one is sufficient. The first layer is structural: a frozen evaluator in a separate process, costs recomputed from raw data, feasibility checked independently, time enforced by the operating system, no network access during runs, and test instances physically absent. The second layer is the Gauntlet's pre-flight critic, prompted to reject any diff that reaches the evaluation path, reads unexpected files or hard-codes data. The third is statistical: the paired gate, a confirmation replicate before any new best becomes the baseline (rule G2 in </w:t>
+      </w:r>
+      <w:r>
+        <w:rPr>
+          <w:rFonts w:ascii="Consolas" w:cs="Consolas" w:eastAsia="Consolas" w:hAnsi="Consolas"/>
+        </w:rPr>
+        <w:t xml:space="preserve">program.md</w:t>
+      </w:r>
+      <w:r>
+        <w:t xml:space="preserve">), and the prediction ledger, which exposes an agent that keeps claiming surprising wins. The fourth is human: the hidden-test score and a human read of every kept diff before the pitch. The research found no published reward-hacking case specific to routing evaluators, but the AlphaEvolve evidence says to expect one (</w:t>
+      </w:r>
+      <w:hyperlink w:history="1" r:id="rIds2f-9c1bwxrj3-2onlyvb">
         <w:r>
           <w:rPr>
             <w:rStyle w:val="Hyperlink"/>
@@ -3290,7 +3494,7 @@
       <w:r>
         <w:t xml:space="preserve">The first row is the one worth pitching, and its modest size should be framed rather than hidden. A 10% relative cut in gap at a 20-second budget is a real, reproducible engineering result against the field's reference solver, confirmed on instances the agent never saw. The second row exists to guarantee a dramatic curve if the first stalls. It must be labelled as improvement over a teaching baseline, not over the state of the art. For scale, AlphaEvolve's reported 10.4% routing-efficiency gain for FM Logistic comes from a secondary source that itself notes the figure is unaudited (</w:t>
       </w:r>
-      <w:hyperlink w:history="1" r:id="rIdxokasnfvhxbt1gkdzoydi">
+      <w:hyperlink w:history="1" r:id="rIdb3me2me68ius_5d-q_cyr">
         <w:r>
           <w:rPr>
             <w:rStyle w:val="Hyperlink"/>
@@ -3315,9 +3519,54 @@
         <w:spacing w:after="160" w:line="300"/>
       </w:pPr>
       <w:r>
-        <w:t xml:space="preserve">With the event one week away, preparation matters more than anything done on the day. Hack-Nation's rules on pre-existing code could not be read, so the team should confirm them with organizers and disclose the harness as prior open-source work. Reusable infrastructure is normal. The improvement loop itself should run live during the event, so that the headline curve is honestly event-produced. Before October 3, the team should build a `logistics` branch of the repo with the rewritten `prepare.py`, the baseline solver file, the adapted `program.md`, a paired and frozen `keep_gate.py`, and a separate human-only test script. It should build the same trio for bin packing and, time permitting, a Taillard variant. It should calibrate `NOISE.md` on the exact cloud CPU machine it will use, and run a short dry loop on a separate instance split to shake out harness bugs. Those dry-run results must not be reused. The team should also pre-build the demo: a small web dashboard that reads the results file live and shows the kept-commit curve, gate verdicts, critic rejections, and before-and-after route maps for a held-out instance. Finally, it should budget its own LLM spend. Past editions advertised OpenAI, Cursor and Lovable credits, but Anthropic appeared in no sponsor list found (</w:t>
-      </w:r>
-      <w:hyperlink w:history="1" r:id="rIdbee3exwmoruajdxy3fnlo">
+        <w:t xml:space="preserve">With the event one week away, preparation matters more than anything done on the day. Hack-Nation's rules on pre-existing code could not be read, so the team should confirm them with organizers and disclose the harness as prior open-source work. Reusable infrastructure is normal. The improvement loop itself should run live during the event, so that the headline curve is honestly event-produced. Before October 3, the team should build a </w:t>
+      </w:r>
+      <w:r>
+        <w:rPr>
+          <w:rFonts w:ascii="Consolas" w:cs="Consolas" w:eastAsia="Consolas" w:hAnsi="Consolas"/>
+        </w:rPr>
+        <w:t xml:space="preserve">logistics</w:t>
+      </w:r>
+      <w:r>
+        <w:t xml:space="preserve"> branch of the repo with the rewritten </w:t>
+      </w:r>
+      <w:r>
+        <w:rPr>
+          <w:rFonts w:ascii="Consolas" w:cs="Consolas" w:eastAsia="Consolas" w:hAnsi="Consolas"/>
+        </w:rPr>
+        <w:t xml:space="preserve">prepare.py</w:t>
+      </w:r>
+      <w:r>
+        <w:t xml:space="preserve">, the baseline solver file, the adapted </w:t>
+      </w:r>
+      <w:r>
+        <w:rPr>
+          <w:rFonts w:ascii="Consolas" w:cs="Consolas" w:eastAsia="Consolas" w:hAnsi="Consolas"/>
+        </w:rPr>
+        <w:t xml:space="preserve">program.md</w:t>
+      </w:r>
+      <w:r>
+        <w:t xml:space="preserve">, a paired and frozen </w:t>
+      </w:r>
+      <w:r>
+        <w:rPr>
+          <w:rFonts w:ascii="Consolas" w:cs="Consolas" w:eastAsia="Consolas" w:hAnsi="Consolas"/>
+        </w:rPr>
+        <w:t xml:space="preserve">keep_gate.py</w:t>
+      </w:r>
+      <w:r>
+        <w:t xml:space="preserve">, and a separate human-only test script. It should build the same trio for bin packing and, time permitting, a Taillard variant. It should calibrate </w:t>
+      </w:r>
+      <w:r>
+        <w:rPr>
+          <w:rFonts w:ascii="Consolas" w:cs="Consolas" w:eastAsia="Consolas" w:hAnsi="Consolas"/>
+        </w:rPr>
+        <w:t xml:space="preserve">NOISE.md</w:t>
+      </w:r>
+      <w:r>
+        <w:t xml:space="preserve"> on the exact cloud CPU machine it will use, and run a short dry loop on a separate instance split to shake out harness bugs. Those dry-run results must not be reused. The team should also pre-build the demo: a small web dashboard that reads the results file live and shows the kept-commit curve, gate verdicts, critic rejections, and before-and-after route maps for a held-out instance. Finally, it should budget its own LLM spend. Past editions advertised OpenAI, Cursor and Lovable credits, but Anthropic appeared in no sponsor list found (</w:t>
+      </w:r>
+      <w:hyperlink w:history="1" r:id="rIdvd8dgn83yj3jo-xpa65rz">
         <w:r>
           <w:rPr>
             <w:rStyle w:val="Hyperlink"/>
@@ -3474,7 +3723,22 @@
                 <w:sz w:val="18"/>
                 <w:szCs w:val="18"/>
               </w:rPr>
-              <w:t xml:space="preserve">Read the challenges and decide between CVRP, bin packing, scheduling or a challenge-specific variant. Adapt `program.md` framing to the sponsor's language. Start the baseline recalibration</w:t>
+              <w:t xml:space="preserve">Read the challenges and decide between CVRP, bin packing, scheduling or a challenge-specific variant. Adapt </w:t>
+            </w:r>
+            <w:r>
+              <w:rPr>
+                <w:rFonts w:ascii="Consolas" w:cs="Consolas" w:eastAsia="Consolas" w:hAnsi="Consolas"/>
+                <w:sz w:val="18"/>
+                <w:szCs w:val="18"/>
+              </w:rPr>
+              <w:t xml:space="preserve">program.md</w:t>
+            </w:r>
+            <w:r>
+              <w:rPr>
+                <w:sz w:val="18"/>
+                <w:szCs w:val="18"/>
+              </w:rPr>
+              <w:t xml:space="preserve"> framing to the sponsor's language. Start the baseline recalibration</w:t>
             </w:r>
           </w:p>
         </w:tc>
@@ -3874,7 +4138,7 @@
       <w:r>
         <w:t xml:space="preserve">Past Hack-Nation winners share a pattern, pieced together from participant repositories because the official showcase could not be read. Winners pair a real technical core with reported metrics, a deployed demo and a quantified business story. A July 2026 London winner shipped a ridge-regression model with reported AUCs against a baseline and a live Vercel demo, under the motto that the "model predicts, LLM only explains" (</w:t>
       </w:r>
-      <w:hyperlink w:history="1" r:id="rId4qhyxmtsgmogxtm1do4hr">
+      <w:hyperlink w:history="1" r:id="rId9poxxk_wvmdrgsan-xwb6">
         <w:r>
           <w:rPr>
             <w:rStyle w:val="Hyperlink"/>
@@ -3885,7 +4149,7 @@
       <w:r>
         <w:t xml:space="preserve">). The February 2026 winner of the "Supply Chain Agents" challenge in the VC Big Bet track built an agent orchestration layer with a graph dashboard and a "$115 trillion" market frame (</w:t>
       </w:r>
-      <w:hyperlink w:history="1" r:id="rIdweycw3jl_o2dvbfk7kkpg">
+      <w:hyperlink w:history="1" r:id="rIdwl54cnub12b1hfeppkkb9">
         <w:r>
           <w:rPr>
             <w:rStyle w:val="Hyperlink"/>
@@ -3896,7 +4160,7 @@
       <w:r>
         <w:t xml:space="preserve">). One sponsor rubric weighted technical accuracy at 35%, innovation at 30%, impact at 25% and user experience at 10% (</w:t>
       </w:r>
-      <w:hyperlink w:history="1" r:id="rId9lxoqcriyilms-n8fptjg">
+      <w:hyperlink w:history="1" r:id="rIdnj9xljrbzgehzidnucink">
         <w:r>
           <w:rPr>
             <w:rStyle w:val="Hyperlink"/>
@@ -3907,7 +4171,7 @@
       <w:r>
         <w:t xml:space="preserve">). The Venture Track picks teams on "technical execution and venture potential" (</w:t>
       </w:r>
-      <w:hyperlink w:history="1" r:id="rIduqupou5c0zqrw-zytdify">
+      <w:hyperlink w:history="1" r:id="rIddskhhbkx4bju_xgle7__z">
         <w:r>
           <w:rPr>
             <w:rStyle w:val="Hyperlink"/>
@@ -3926,7 +4190,7 @@
       <w:r>
         <w:t xml:space="preserve">The pitch should therefore sell auditability first and the algorithm second. Open with the trust problem, where most supply chain leaders cannot say what their AI returns. Then show a loop that ran unattended for most of a day, proposed on the order of a hundred changes, rejected the large majority as noise or invalid, and kept a few that survived a statistical gate and a hidden test. Show the kept-commit curve, a readable diff of the best change, a critic log entry where a shortcut was caught, and the prediction ledger's record of the agent's own overconfidence. Only then state the held-out gain against stock PyVRP, with its confidence interval. The venture framing follows naturally: a service that takes a carrier's historical routing instances, runs a gated overnight loop against their current solver, and returns a change backed by a hidden-test report. The fit with the event depends on the announced challenges. The entry maps most naturally onto an agents, "AI scientist" or supply chain challenge, all of which have appeared in past editions (</w:t>
       </w:r>
-      <w:hyperlink w:history="1" r:id="rIdc9xvwunpfqkakoiwvbcqn">
+      <w:hyperlink w:history="1" r:id="rId4girajj1j0arzrh5qxn2l">
         <w:r>
           <w:rPr>
             <w:rStyle w:val="Hyperlink"/>
@@ -3937,7 +4201,7 @@
       <w:r>
         <w:t xml:space="preserve">; </w:t>
       </w:r>
-      <w:hyperlink w:history="1" r:id="rIdl1cq-flakgnhjke3tlnfb">
+      <w:hyperlink w:history="1" r:id="rId2a8cfcgdb0a459xyd0bbu">
         <w:r>
           <w:rPr>
             <w:rStyle w:val="Hyperlink"/>
@@ -3964,7 +4228,7 @@
       <w:r>
         <w:t xml:space="preserve">Hack-Nation reveals challenges at kickoff, and sponsors set them (</w:t>
       </w:r>
-      <w:hyperlink w:history="1" r:id="rId1tfkqaqz7-whsputdjspg">
+      <w:hyperlink w:history="1" r:id="rIdbjtzftrgypojqwlznqb20">
         <w:r>
           <w:rPr>
             <w:rStyle w:val="Hyperlink"/>
@@ -3975,7 +4239,7 @@
       <w:r>
         <w:t xml:space="preserve">). If no challenge touches logistics, optimization or research agents, even a perfect loop scores poorly on challenge fit. The mitigation is the harness's generality: the same frozen-evaluator pattern can score a sponsor's own metric if it is cheap, deterministic enough and single-valued. The second risk is an empty result. The parzival ledger kept almost nothing after its import, and a 24-hour loop against a strong solver can plausibly end with no keeps. The hour-16 checkpoint and the weak-baseline variant exist for this case. The third risk is overfitting that the hidden test exposes too late. This is cheap to guard against, and it is also a pitchable moment if it happens, since the protocol caught it. The fourth risk is a product gap. A command-line loop is not a deployed product, so the dashboard and the "bring your instances" flow must be real. The fifth is operational: cloud CPU availability, LLM rate limits and cost, and the security of running agent-written code, which argues for a disposable virtual machine with no credentials on it. The last is informational. The event date, the MIT hub and the hybrid 24-hour format rest on search snippets of pages that could not be opened (</w:t>
       </w:r>
-      <w:hyperlink w:history="1" r:id="rId8wglfkldrucuo1qieodhw">
+      <w:hyperlink w:history="1" r:id="rIdx1uldwjvvvntp0mhiubo_">
         <w:r>
           <w:rPr>
             <w:rStyle w:val="Hyperlink"/>
@@ -3986,7 +4250,7 @@
       <w:r>
         <w:t xml:space="preserve">; </w:t>
       </w:r>
-      <w:hyperlink w:history="1" r:id="rIdntql5ddwkofxou69bovli">
+      <w:hyperlink w:history="1" r:id="rIdq_3ev_7u-h3glpy0lypku">
         <w:r>
           <w:rPr>
             <w:rStyle w:val="Hyperlink"/>

</xml_diff>